<commit_message>
Corrigir muitos bugs, responsividade, travessoes, validade, preco por unidade etc
</commit_message>
<xml_diff>
--- a/legal/politica-de-privacidade.docx
+++ b/legal/politica-de-privacidade.docx
@@ -28,7 +28,7 @@
           <w:sz w:val="22"/>
           <w:szCs w:val="22"/>
         </w:rPr>
-        <w:t xml:space="preserve">Kuava POS — última atualização: agosto de 2026</w:t>
+        <w:t xml:space="preserve">Kuava POS · última atualização: agosto de 2026</w:t>
       </w:r>
     </w:p>
     <w:p>
@@ -47,7 +47,7 @@
           <w:i/>
           <w:iCs/>
         </w:rPr>
-        <w:t xml:space="preserve">Nota importante: este documento é um modelo de base, gerado para acelerar o arranque da Kuava POS, e não constitui aconselhamento jurídico. Antes de publicar/usar este documento com clientes reais, deve ser revisto por um advogado moçambicano — em particular para confirmar o enquadramento fiscal (emissão de faturas, NUIT), preencher os campos entre parênteses retos [ ] com os dados legais reais da empresa, e acompanhar a nova Lei de Proteção de Dados Pessoais, aprovada pelo Conselho de Ministros e ainda pendente de aprovação na Assembleia da República à data deste documento — este texto deverá ser atualizado assim que essa lei entrar em vigor.</w:t>
+        <w:t xml:space="preserve">Nota importante: este documento é um modelo de base, gerado para acelerar o arranque da Kuava POS, e não constitui aconselhamento jurídico. Antes de publicar/usar este documento com clientes reais, deve ser revisto por um advogado moçambicano, em particular para confirmar o enquadramento fiscal (emissão de faturas, NUIT), preencher os campos entre parênteses retos [ ] com os dados legais reais da empresa, e acompanhar a nova Lei de Proteção de Dados Pessoais, aprovada pelo Conselho de Ministros e ainda pendente de aprovação na Assembleia da República à data deste documento. Este texto deverá ser atualizado assim que essa lei entrar em vigor.</w:t>
       </w:r>
     </w:p>
     <w:p>
@@ -81,15 +81,15 @@
         <w:spacing w:after="160"/>
       </w:pPr>
       <w:r>
-        <w:t xml:space="preserve">Moçambique ainda não tem, à data desta política, uma lei geral de proteção de dados pessoais em vigor — uma proposta de lei já foi aprovada pelo Conselho de Ministros e encontra-se pendente de submissão e aprovação pela Assembleia da República. Enquanto isso, aplicam-se as proteções gerais da Constituição da República (direito à vida privada) e obrigações específicas da Lei das Transações Eletrónicas (2017) para dados tratados eletronicamente.</w:t>
-      </w:r>
-    </w:p>
-    <w:p>
-      <w:pPr>
-        <w:spacing w:after="160"/>
-      </w:pPr>
-      <w:r>
-        <w:t xml:space="preserve">Mesmo na ausência de uma lei geral em vigor, a Kuava compromete-se a seguir os princípios internacionalmente reconhecidos de boa prática em proteção de dados — minimização, finalidade definida, segurança e direitos do titular — descritos nesta política, e a atualizá-la assim que a nova legislação moçambicana entrar em vigor.</w:t>
+        <w:t xml:space="preserve">Moçambique ainda não tem, à data desta política, uma lei geral de proteção de dados pessoais em vigor. Uma proposta de lei já foi aprovada pelo Conselho de Ministros e encontra-se pendente de submissão e aprovação pela Assembleia da República. Enquanto isso, aplicam-se as proteções gerais da Constituição da República (direito à vida privada) e obrigações específicas da Lei das Transações Eletrónicas (2017) para dados tratados eletronicamente.</w:t>
+      </w:r>
+    </w:p>
+    <w:p>
+      <w:pPr>
+        <w:spacing w:after="160"/>
+      </w:pPr>
+      <w:r>
+        <w:t xml:space="preserve">Mesmo na ausência de uma lei geral em vigor, a Kuava compromete-se a seguir os princípios internacionalmente reconhecidos de boa prática em proteção de dados (minimização, finalidade definida, segurança e direitos do titular) descritos nesta política, e a atualizá-la assim que a nova legislação moçambicana entrar em vigor.</w:t>
       </w:r>
     </w:p>
     <w:p>
@@ -142,7 +142,7 @@
         <w:spacing w:after="100"/>
       </w:pPr>
       <w:r>
-        <w:t xml:space="preserve">Nome, email, palavra-passe (guardada apenas de forma encriptada — nunca em texto simples), função/role dentro do Estabelecimento.</w:t>
+        <w:t xml:space="preserve">Nome, email, palavra-passe (guardada apenas de forma encriptada, nunca em texto simples), função/role dentro do Estabelecimento.</w:t>
       </w:r>
     </w:p>
     <w:p>
@@ -177,28 +177,28 @@
         <w:spacing w:after="100"/>
       </w:pPr>
       <w:r>
-        <w:t xml:space="preserve">Registos de vendas e faturas — podem incluir nome/NUIT de clientes finais do Estabelecimento, quando estes são incluídos numa fatura.</w:t>
-      </w:r>
-    </w:p>
-    <w:p>
-      <w:pPr>
-        <w:pStyle w:val="ListParagraph"/>
-        <w:numPr>
-          <w:ilvl w:val="0"/>
-          <w:numId w:val="1"/>
-        </w:numPr>
-        <w:spacing w:after="100"/>
-      </w:pPr>
-      <w:r>
-        <w:t xml:space="preserve">Referências de confirmação de pagamento por M-Pesa/e-Mola inseridas manualmente pelo Estabelecimento (ex.: código SMS) — a Kuava POS não processa pagamentos diretamente nem acede a contas M-Pesa/e-Mola.</w:t>
-      </w:r>
-    </w:p>
-    <w:p>
-      <w:pPr>
-        <w:spacing w:after="160"/>
-      </w:pPr>
-      <w:r>
-        <w:t xml:space="preserve">A Kuava POS não recolhe nem guarda dados de cartões bancários ou credenciais de pagamento — não existe processamento automático de pagamentos dentro do Serviço nesta fase.</w:t>
+        <w:t xml:space="preserve">Registos de vendas e faturas: podem incluir nome/NUIT de clientes finais do Estabelecimento, quando estes são incluídos numa fatura.</w:t>
+      </w:r>
+    </w:p>
+    <w:p>
+      <w:pPr>
+        <w:pStyle w:val="ListParagraph"/>
+        <w:numPr>
+          <w:ilvl w:val="0"/>
+          <w:numId w:val="1"/>
+        </w:numPr>
+        <w:spacing w:after="100"/>
+      </w:pPr>
+      <w:r>
+        <w:t xml:space="preserve">Referências de confirmação de pagamento por M-Pesa/e-Mola inseridas manualmente pelo Estabelecimento (ex.: código SMS). A Kuava POS não processa pagamentos diretamente nem acede a contas M-Pesa/e-Mola.</w:t>
+      </w:r>
+    </w:p>
+    <w:p>
+      <w:pPr>
+        <w:spacing w:after="160"/>
+      </w:pPr>
+      <w:r>
+        <w:t xml:space="preserve">A Kuava POS não recolhe nem guarda dados de cartões bancários ou credenciais de pagamento. Não existe processamento automático de pagamentos dentro do Serviço nesta fase.</w:t>
       </w:r>
     </w:p>
     <w:p>
@@ -233,7 +233,7 @@
         <w:spacing w:after="100"/>
       </w:pPr>
       <w:r>
-        <w:t xml:space="preserve">Comunicar sobre a conta — confirmações, avisos de fim de período experimental, ativação de plano, suporte.</w:t>
+        <w:t xml:space="preserve">Comunicar sobre a conta: confirmações, avisos de fim de período experimental, ativação de plano, suporte.</w:t>
       </w:r>
     </w:p>
     <w:p>
@@ -332,7 +332,7 @@
         <w:spacing w:after="100"/>
       </w:pPr>
       <w:r>
-        <w:t xml:space="preserve">Palavras-passe guardadas com encriptação unidirecional (bcrypt) — a Kuava nunca vê nem consegue recuperar a palavra-passe original de um Utilizador.</w:t>
+        <w:t xml:space="preserve">Palavras-passe guardadas com encriptação unidirecional (bcrypt). A Kuava nunca vê nem consegue recuperar a palavra-passe original de um Utilizador.</w:t>
       </w:r>
     </w:p>
     <w:p>
@@ -358,7 +358,7 @@
         <w:spacing w:after="100"/>
       </w:pPr>
       <w:r>
-        <w:t xml:space="preserve">Isolamento de dados entre Estabelecimentos — um Estabelecimento nunca tem acesso aos dados de outro.</w:t>
+        <w:t xml:space="preserve">Isolamento de dados entre Estabelecimentos: um Estabelecimento nunca tem acesso aos dados de outro.</w:t>
       </w:r>
     </w:p>
     <w:p>
@@ -388,7 +388,7 @@
         <w:spacing w:after="160"/>
       </w:pPr>
       <w:r>
-        <w:t xml:space="preserve">Os Dados do Estabelecimento são conservados enquanto a conta estiver ativa. Após o encerramento de uma conta, os dados são conservados por um período razoável (até 90 dias) para permitir reativação a pedido do Estabelecimento, findo o qual são eliminados — salvo quando a lei moçambicana exigir conservação mais longa (ex.: registos fiscais/faturação).</w:t>
+        <w:t xml:space="preserve">Os Dados do Estabelecimento são conservados enquanto a conta estiver ativa. Após o encerramento de uma conta, os dados são conservados por um período razoável (até 90 dias) para permitir reativação a pedido do Estabelecimento, findo o qual são eliminados, salvo quando a lei moçambicana exigir conservação mais longa (ex.: registos fiscais/faturação).</w:t>
       </w:r>
     </w:p>
     <w:p>

</xml_diff>